<commit_message>
docs: condense revised paper to 7 pages; renumber response references
Paper: 3 figures kept, preemption-cost and calibrated-comparison tables
folded into text, ablation and sensing tables compacted (13 -> 10 tables),
methods and related work tightened. All results and reviewer answers kept.

Co-Authored-By: Claude Opus 5.5 <noreply@anthropic.com>
</commit_message>
<xml_diff>
--- a/paper/final/Response_to_Reviewers_Paper2017.docx
+++ b/paper/final/Response_to_Reviewers_Paper2017.docx
@@ -43,7 +43,7 @@
           <w:szCs w:val="22"/>
           <w:rFonts w:ascii="Times New Roman" w:cs="Times New Roman" w:eastAsia="Times New Roman" w:hAnsi="Times New Roman"/>
         </w:rPr>
-        <w:t xml:space="preserve">We thank the reviewers for their comments. Below, each comment is followed by our response and the exact changes in the revised manuscript (section, table and figure numbers refer to the revised version). Every number in the revised paper is produced by scripts in the public repository (github.com/shivam-G05/Smart-Traffic-Management): scripts/benchmark.py (Tables II, V and X), scripts/oversaturation.py (Tables III, IV and X, Fig. 4), scripts/peak_period.py (Fig. 5), scripts/sensing.py (Tables XI-XII), scripts/calibrate_weights.py (Table XIII), scripts/ablation.py (Table VI), scripts/vision_eval.py (Tables VII and VIII) and scripts/kinematics_check.py (Table IX).</w:t>
+        <w:t xml:space="preserve">We thank the reviewers for their comments. Below, each comment is followed by our response and the exact changes in the revised manuscript (section, table and figure numbers refer to the revised version). Every number in the revised paper is produced by scripts in the public repository (github.com/shivam-G05/Smart-Traffic-Management): scripts/benchmark.py (Table II, Sec. IV-D and IV-G), scripts/oversaturation.py (Tables III–IV, Fig. 4, Sec. IV-G), scripts/peak_period.py (Fig. 5), scripts/sensing.py (Table IX), scripts/calibrate_weights.py (Table X), scripts/ablation.py (Table V), scripts/vision_eval.py (Tables VI and VII) and scripts/kinematics_check.py (Table VIII).</w:t>
       </w:r>
     </w:p>
     <w:p>
@@ -191,25 +191,25 @@
                 <w:szCs w:val="22"/>
                 <w:rFonts w:ascii="Times New Roman" w:cs="Times New Roman" w:eastAsia="Times New Roman" w:hAnsi="Times New Roman"/>
               </w:rPr>
-              <w:t xml:space="preserve">Sec. I: new "Motivation" and "Novelty and difference from existing approaches" paragraphs; contributions list updated (discharge hold, stronger evaluation).</w:t>
-            </w:r>
-          </w:p>
-          <w:p>
-            <w:pPr>
-              <w:pStyle w:val="ListParagraph"/>
-              <w:numPr>
-                <w:ilvl w:val="0"/>
-                <w:numId w:val="1"/>
-              </w:numPr>
-              <w:spacing w:after="40"/>
-            </w:pPr>
-            <w:r>
-              <w:rPr>
-                <w:sz w:val="22"/>
-                <w:szCs w:val="22"/>
-                <w:rFonts w:ascii="Times New Roman" w:cs="Times New Roman" w:eastAsia="Times New Roman" w:hAnsi="Times New Roman"/>
-              </w:rPr>
-              <w:t xml:space="preserve">Sec. II-A: vehicle-actuated control and gap-out added to the related work [23]; Sec. II-B ends with how this work differs.</w:t>
+              <w:t xml:space="preserve">Sec. I: new "Motivation" and "Novelty" paragraphs; contributions list updated (discharge hold, stronger evaluation).</w:t>
+            </w:r>
+          </w:p>
+          <w:p>
+            <w:pPr>
+              <w:pStyle w:val="ListParagraph"/>
+              <w:numPr>
+                <w:ilvl w:val="0"/>
+                <w:numId w:val="1"/>
+              </w:numPr>
+              <w:spacing w:after="40"/>
+            </w:pPr>
+            <w:r>
+              <w:rPr>
+                <w:sz w:val="22"/>
+                <w:szCs w:val="22"/>
+                <w:rFonts w:ascii="Times New Roman" w:cs="Times New Roman" w:eastAsia="Times New Roman" w:hAnsi="Times New Roman"/>
+              </w:rPr>
+              <w:t xml:space="preserve">Sec. II: vehicle-actuated control and gap-out added to the related work [23]; the section ends with how this work differs.</w:t>
             </w:r>
           </w:p>
           <w:p>
@@ -342,97 +342,97 @@
                 <w:szCs w:val="22"/>
                 <w:rFonts w:ascii="Times New Roman" w:cs="Times New Roman" w:eastAsia="Times New Roman" w:hAnsi="Times New Roman"/>
               </w:rPr>
-              <w:t xml:space="preserve"> We re-implemented four strategies from the related work in the same simulator and compared them with the proposed controller on identical seeded traffic (ten paired seeds per condition): a Webster-optimized fixed plan [2], vehicle-actuated control [23], max-pressure control [11] (which also represents busiest-lane-first control [6]) and three-level density control [1]. All share the same phase sequence and change intervals, so the comparison isolates the switching decision. Below capacity (Table II) the proposed controller reduced delay by 35.3–36.1% relative to the 20 s fixed plan, but the Webster plan, actuated and max-pressure control did as well (37.5–39.7%, 37.2–39.9%, 37.3–39.8%); three-level density control was worse than the fixed plan at medium and high demand. Near and above capacity (Tables III and IV, Fig. 4) the original density rule lost 18.9% of capacity; the discharge-hold rule restored it (+9.8% relative to fixed timing). The ablation (Table VI) was extended from four to ten variants. It shows that the score's benefit comes from the queued/moving distinction (removing it: +35.1% and +33.0% delay at medium and high demand), not from the class weights (setting them to 1: −3.9% and −3.2%). This corrects a statement in the original Conclusion.</w:t>
-            </w:r>
-          </w:p>
-          <w:p>
-            <w:pPr>
-              <w:pStyle w:val="ListParagraph"/>
-              <w:numPr>
-                <w:ilvl w:val="0"/>
-                <w:numId w:val="1"/>
-              </w:numPr>
-              <w:spacing w:after="40"/>
-            </w:pPr>
-            <w:r>
-              <w:rPr>
-                <w:sz w:val="22"/>
-                <w:szCs w:val="22"/>
-                <w:rFonts w:ascii="Times New Roman" w:cs="Times New Roman" w:eastAsia="Times New Roman" w:hAnsi="Times New Roman"/>
-              </w:rPr>
-              <w:t xml:space="preserve">Sec. IV-E (new): the four comparison controllers.</w:t>
-            </w:r>
-          </w:p>
-          <w:p>
-            <w:pPr>
-              <w:pStyle w:val="ListParagraph"/>
-              <w:numPr>
-                <w:ilvl w:val="0"/>
-                <w:numId w:val="1"/>
-              </w:numPr>
-              <w:spacing w:after="40"/>
-            </w:pPr>
-            <w:r>
-              <w:rPr>
-                <w:sz w:val="22"/>
-                <w:szCs w:val="22"/>
-                <w:rFonts w:ascii="Times New Roman" w:cs="Times New Roman" w:eastAsia="Times New Roman" w:hAnsi="Times New Roman"/>
-              </w:rPr>
-              <w:t xml:space="preserve">Sec. V-C and Table II: comparison of seven controllers at three demand levels.</w:t>
-            </w:r>
-          </w:p>
-          <w:p>
-            <w:pPr>
-              <w:pStyle w:val="ListParagraph"/>
-              <w:numPr>
-                <w:ilvl w:val="0"/>
-                <w:numId w:val="1"/>
-              </w:numPr>
-              <w:spacing w:after="40"/>
-            </w:pPr>
-            <w:r>
-              <w:rPr>
-                <w:sz w:val="22"/>
-                <w:szCs w:val="22"/>
-                <w:rFonts w:ascii="Times New Roman" w:cs="Times New Roman" w:eastAsia="Times New Roman" w:hAnsi="Times New Roman"/>
-              </w:rPr>
-              <w:t xml:space="preserve">Sec. V-D, Tables III–IV and Fig. 4 (new): capacity and delay from 0.6 to 1.5 times capacity.</w:t>
-            </w:r>
-          </w:p>
-          <w:p>
-            <w:pPr>
-              <w:pStyle w:val="ListParagraph"/>
-              <w:numPr>
-                <w:ilvl w:val="0"/>
-                <w:numId w:val="1"/>
-              </w:numPr>
-              <w:spacing w:after="40"/>
-            </w:pPr>
-            <w:r>
-              <w:rPr>
-                <w:sz w:val="22"/>
-                <w:szCs w:val="22"/>
-                <w:rFonts w:ascii="Times New Roman" w:cs="Times New Roman" w:eastAsia="Times New Roman" w:hAnsi="Times New Roman"/>
-              </w:rPr>
-              <w:t xml:space="preserve">Sec. V-F and Table VI: ablation extended (score components, θ, discharge-hold zone, preemption).</w:t>
-            </w:r>
-          </w:p>
-          <w:p>
-            <w:pPr>
-              <w:pStyle w:val="ListParagraph"/>
-              <w:numPr>
-                <w:ilvl w:val="0"/>
-                <w:numId w:val="1"/>
-              </w:numPr>
-              <w:spacing w:after="40"/>
-            </w:pPr>
-            <w:r>
-              <w:rPr>
-                <w:sz w:val="22"/>
-                <w:szCs w:val="22"/>
-                <w:rFonts w:ascii="Times New Roman" w:cs="Times New Roman" w:eastAsia="Times New Roman" w:hAnsi="Times New Roman"/>
-              </w:rPr>
-              <w:t xml:space="preserve">Abstract, Sec. VI-A and Sec. VII rewritten to report these results, including the corrected conclusion about class weights.</w:t>
+              <w:t xml:space="preserve"> We re-implemented four strategies from the related work in the same simulator and compared them with the proposed controller on identical seeded traffic (ten paired seeds per condition): a Webster-optimized fixed plan [2], vehicle-actuated control [23], max-pressure control [11] (which also represents busiest-lane-first control [6]) and three-level density control [1]. All share the same phase sequence and change intervals, so the comparison isolates the switching decision. Below capacity (Table II) the proposed controller reduced delay by 35.3–36.1% relative to the 20 s fixed plan, but the Webster plan, actuated and max-pressure control did as well (37.5–39.7%, 37.2–39.9%, 37.3–39.8%); three-level density control was worse than the fixed plan at medium and high demand. Near and above capacity (Tables III and IV, Fig. 4) the original density rule lost 18.9% of capacity; the discharge-hold rule restored it (+9.8% relative to fixed timing). The ablation (Table V) was extended from four to ten variants. It shows that the score's benefit comes from the queued/moving distinction (removing it: +35.1% and +33.0% delay at medium and high demand), not from the class weights (setting them to 1: −3.9% and −3.2%). This corrects a statement in the original Conclusion.</w:t>
+            </w:r>
+          </w:p>
+          <w:p>
+            <w:pPr>
+              <w:pStyle w:val="ListParagraph"/>
+              <w:numPr>
+                <w:ilvl w:val="0"/>
+                <w:numId w:val="1"/>
+              </w:numPr>
+              <w:spacing w:after="40"/>
+            </w:pPr>
+            <w:r>
+              <w:rPr>
+                <w:sz w:val="22"/>
+                <w:szCs w:val="22"/>
+                <w:rFonts w:ascii="Times New Roman" w:cs="Times New Roman" w:eastAsia="Times New Roman" w:hAnsi="Times New Roman"/>
+              </w:rPr>
+              <w:t xml:space="preserve">Sec. III-E (new): the four comparison controllers.</w:t>
+            </w:r>
+          </w:p>
+          <w:p>
+            <w:pPr>
+              <w:pStyle w:val="ListParagraph"/>
+              <w:numPr>
+                <w:ilvl w:val="0"/>
+                <w:numId w:val="1"/>
+              </w:numPr>
+              <w:spacing w:after="40"/>
+            </w:pPr>
+            <w:r>
+              <w:rPr>
+                <w:sz w:val="22"/>
+                <w:szCs w:val="22"/>
+                <w:rFonts w:ascii="Times New Roman" w:cs="Times New Roman" w:eastAsia="Times New Roman" w:hAnsi="Times New Roman"/>
+              </w:rPr>
+              <w:t xml:space="preserve">Sec. IV-B and Table II: comparison of seven controllers at three demand levels.</w:t>
+            </w:r>
+          </w:p>
+          <w:p>
+            <w:pPr>
+              <w:pStyle w:val="ListParagraph"/>
+              <w:numPr>
+                <w:ilvl w:val="0"/>
+                <w:numId w:val="1"/>
+              </w:numPr>
+              <w:spacing w:after="40"/>
+            </w:pPr>
+            <w:r>
+              <w:rPr>
+                <w:sz w:val="22"/>
+                <w:szCs w:val="22"/>
+                <w:rFonts w:ascii="Times New Roman" w:cs="Times New Roman" w:eastAsia="Times New Roman" w:hAnsi="Times New Roman"/>
+              </w:rPr>
+              <w:t xml:space="preserve">Sec. IV-C, Tables III–IV and Fig. 4 (new): capacity and delay from 0.6 to 1.5 times capacity.</w:t>
+            </w:r>
+          </w:p>
+          <w:p>
+            <w:pPr>
+              <w:pStyle w:val="ListParagraph"/>
+              <w:numPr>
+                <w:ilvl w:val="0"/>
+                <w:numId w:val="1"/>
+              </w:numPr>
+              <w:spacing w:after="40"/>
+            </w:pPr>
+            <w:r>
+              <w:rPr>
+                <w:sz w:val="22"/>
+                <w:szCs w:val="22"/>
+                <w:rFonts w:ascii="Times New Roman" w:cs="Times New Roman" w:eastAsia="Times New Roman" w:hAnsi="Times New Roman"/>
+              </w:rPr>
+              <w:t xml:space="preserve">Sec. IV-E and Table V: ablation extended (score components, θ, discharge-hold zone, preemption).</w:t>
+            </w:r>
+          </w:p>
+          <w:p>
+            <w:pPr>
+              <w:pStyle w:val="ListParagraph"/>
+              <w:numPr>
+                <w:ilvl w:val="0"/>
+                <w:numId w:val="1"/>
+              </w:numPr>
+              <w:spacing w:after="40"/>
+            </w:pPr>
+            <w:r>
+              <w:rPr>
+                <w:sz w:val="22"/>
+                <w:szCs w:val="22"/>
+                <w:rFonts w:ascii="Times New Roman" w:cs="Times New Roman" w:eastAsia="Times New Roman" w:hAnsi="Times New Roman"/>
+              </w:rPr>
+              <w:t xml:space="preserve">Abstract, Sec. V and Sec. VI rewritten to report these results, including the corrected conclusion about class weights.</w:t>
             </w:r>
           </w:p>
           <w:p>
@@ -583,7 +583,7 @@
                 <w:szCs w:val="22"/>
                 <w:rFonts w:ascii="Times New Roman" w:cs="Times New Roman" w:eastAsia="Times New Roman" w:hAnsi="Times New Roman"/>
               </w:rPr>
-              <w:t xml:space="preserve">Sec. III: new paragraph "Method workflow" and new Fig. 2.</w:t>
+              <w:t xml:space="preserve">Sec. III-A: method workflow description and new Fig. 2.</w:t>
             </w:r>
           </w:p>
           <w:p>
@@ -734,61 +734,61 @@
                 <w:szCs w:val="22"/>
                 <w:rFonts w:ascii="Times New Roman" w:cs="Times New Roman" w:eastAsia="Times New Roman" w:hAnsi="Times New Roman"/>
               </w:rPr>
-              <w:t xml:space="preserve"> The Limitations subsection was rewritten. The bullet on under-saturated demand was removed because that condition is now tested, and new limitations were added: the high simulated saturation flow (no driver reaction time), the deterministic arrival model, the frequency of emergency vehicles, the use of re-implemented baselines with ideal sensing, and the uncalibrated class weights. We also corrected a factual error: the original text described the arrivals as a Poisson process, whereas the simulator uses deterministic headways at a rate redrawn every 15 s; Sec. IV-A now says so. The manuscript was edited throughout for consistent terminology, units and table/figure references.</w:t>
-            </w:r>
-          </w:p>
-          <w:p>
-            <w:pPr>
-              <w:pStyle w:val="ListParagraph"/>
-              <w:numPr>
-                <w:ilvl w:val="0"/>
-                <w:numId w:val="1"/>
-              </w:numPr>
-              <w:spacing w:after="40"/>
-            </w:pPr>
-            <w:r>
-              <w:rPr>
-                <w:sz w:val="22"/>
-                <w:szCs w:val="22"/>
-                <w:rFonts w:ascii="Times New Roman" w:cs="Times New Roman" w:eastAsia="Times New Roman" w:hAnsi="Times New Roman"/>
-              </w:rPr>
-              <w:t xml:space="preserve">Sec. VI-B: limitations rewritten.</w:t>
-            </w:r>
-          </w:p>
-          <w:p>
-            <w:pPr>
-              <w:pStyle w:val="ListParagraph"/>
-              <w:numPr>
-                <w:ilvl w:val="0"/>
-                <w:numId w:val="1"/>
-              </w:numPr>
-              <w:spacing w:after="40"/>
-            </w:pPr>
-            <w:r>
-              <w:rPr>
-                <w:sz w:val="22"/>
-                <w:szCs w:val="22"/>
-                <w:rFonts w:ascii="Times New Roman" w:cs="Times New Roman" w:eastAsia="Times New Roman" w:hAnsi="Times New Roman"/>
-              </w:rPr>
-              <w:t xml:space="preserve">Sec. IV-A: arrival model corrected; above-capacity simulation options described.</w:t>
-            </w:r>
-          </w:p>
-          <w:p>
-            <w:pPr>
-              <w:pStyle w:val="ListParagraph"/>
-              <w:numPr>
-                <w:ilvl w:val="0"/>
-                <w:numId w:val="1"/>
-              </w:numPr>
-              <w:spacing w:after="40"/>
-            </w:pPr>
-            <w:r>
-              <w:rPr>
-                <w:sz w:val="22"/>
-                <w:szCs w:val="22"/>
-                <w:rFonts w:ascii="Times New Roman" w:cs="Times New Roman" w:eastAsia="Times New Roman" w:hAnsi="Times New Roman"/>
-              </w:rPr>
-              <w:t xml:space="preserve">Whole manuscript: language and formatting pass; test count updated (68 → 119).</w:t>
+              <w:t xml:space="preserve"> The Limitations paragraph was rewritten. The bullet on under-saturated demand was removed because that condition is now tested, and new limitations were added: the high simulated saturation flow (no driver reaction time), the deterministic arrival model, the frequency of emergency vehicles, the use of re-implemented baselines with ideal sensing, and the uncalibrated class weights. We also corrected a factual error: the original text described the arrivals as a Poisson process, whereas the simulator uses deterministic headways at a rate redrawn every 15 s; Sec. III-B now says so. The manuscript was edited throughout for consistent terminology, units and table/figure references.</w:t>
+            </w:r>
+          </w:p>
+          <w:p>
+            <w:pPr>
+              <w:pStyle w:val="ListParagraph"/>
+              <w:numPr>
+                <w:ilvl w:val="0"/>
+                <w:numId w:val="1"/>
+              </w:numPr>
+              <w:spacing w:after="40"/>
+            </w:pPr>
+            <w:r>
+              <w:rPr>
+                <w:sz w:val="22"/>
+                <w:szCs w:val="22"/>
+                <w:rFonts w:ascii="Times New Roman" w:cs="Times New Roman" w:eastAsia="Times New Roman" w:hAnsi="Times New Roman"/>
+              </w:rPr>
+              <w:t xml:space="preserve">Sec. V: limitations paragraph rewritten.</w:t>
+            </w:r>
+          </w:p>
+          <w:p>
+            <w:pPr>
+              <w:pStyle w:val="ListParagraph"/>
+              <w:numPr>
+                <w:ilvl w:val="0"/>
+                <w:numId w:val="1"/>
+              </w:numPr>
+              <w:spacing w:after="40"/>
+            </w:pPr>
+            <w:r>
+              <w:rPr>
+                <w:sz w:val="22"/>
+                <w:szCs w:val="22"/>
+                <w:rFonts w:ascii="Times New Roman" w:cs="Times New Roman" w:eastAsia="Times New Roman" w:hAnsi="Times New Roman"/>
+              </w:rPr>
+              <w:t xml:space="preserve">Sec. III-B: arrival model corrected; above-capacity simulation options described.</w:t>
+            </w:r>
+          </w:p>
+          <w:p>
+            <w:pPr>
+              <w:pStyle w:val="ListParagraph"/>
+              <w:numPr>
+                <w:ilvl w:val="0"/>
+                <w:numId w:val="1"/>
+              </w:numPr>
+              <w:spacing w:after="40"/>
+            </w:pPr>
+            <w:r>
+              <w:rPr>
+                <w:sz w:val="22"/>
+                <w:szCs w:val="22"/>
+                <w:rFonts w:ascii="Times New Roman" w:cs="Times New Roman" w:eastAsia="Times New Roman" w:hAnsi="Times New Roman"/>
+              </w:rPr>
+              <w:t xml:space="preserve">Whole manuscript: language and formatting pass; test count updated (68 → 119); condensed to seven pages.</w:t>
             </w:r>
           </w:p>
           <w:p>
@@ -951,79 +951,79 @@
                 <w:szCs w:val="22"/>
                 <w:rFonts w:ascii="Times New Roman" w:cs="Times New Roman" w:eastAsia="Times New Roman" w:hAnsi="Times New Roman"/>
               </w:rPr>
-              <w:t xml:space="preserve"> We validated two kinds of kinematic output. (a) The tracker's speed estimates: for every confirmed track on a real vehicle, the Kalman velocity was compared with the vehicle's true speed (Table VIII). The result is negative and reported as such: the mean absolute error was 0.53 m/s over 82 estimates, but the vehicles concerned moved at only 0.56 m/s on average, because tracks are confirmed almost only on queued vehicles; the pipeline therefore provides no usable kinematics for moving traffic. (b) The simulator's own kinematics against external field values: we measured queue discharge at the stop line as a traffic engineer would and compared it with the Highway Capacity Manual's base saturation flow (1900 veh/h/lane, 1.89 s headway). This revealed that the model discharged cars every 0.51 s, far too fast, because its car-following rule had no driver reaction time. We added a reaction time, calibrated it to 1.6 s (1.92 s, 1877 veh/h/lane), and repeated all main comparisons with the calibrated model: below capacity the adaptive controller reduced delay by 33.7–35.4% relative to the fixed plan. The calibration also revealed that the discharge hold's 10 m stop-line zone, chosen for the old kinematics, is too short for realistic vehicle spacing (capacity −3.7% relative to fixed timing); re-tuned on a separate seed to 20 m it reached +6.1% (Table X). We report both.</w:t>
-            </w:r>
-          </w:p>
-          <w:p>
-            <w:pPr>
-              <w:pStyle w:val="ListParagraph"/>
-              <w:numPr>
-                <w:ilvl w:val="0"/>
-                <w:numId w:val="1"/>
-              </w:numPr>
-              <w:spacing w:after="40"/>
-            </w:pPr>
-            <w:r>
-              <w:rPr>
-                <w:sz w:val="22"/>
-                <w:szCs w:val="22"/>
-                <w:rFonts w:ascii="Times New Roman" w:cs="Times New Roman" w:eastAsia="Times New Roman" w:hAnsi="Times New Roman"/>
-              </w:rPr>
-              <w:t xml:space="preserve">Sec. IV-A: reaction time introduced as an option of rule (1).</w:t>
-            </w:r>
-          </w:p>
-          <w:p>
-            <w:pPr>
-              <w:pStyle w:val="ListParagraph"/>
-              <w:numPr>
-                <w:ilvl w:val="0"/>
-                <w:numId w:val="1"/>
-              </w:numPr>
-              <w:spacing w:after="40"/>
-            </w:pPr>
-            <w:r>
-              <w:rPr>
-                <w:sz w:val="22"/>
-                <w:szCs w:val="22"/>
-                <w:rFonts w:ascii="Times New Roman" w:cs="Times New Roman" w:eastAsia="Times New Roman" w:hAnsi="Times New Roman"/>
-              </w:rPr>
-              <w:t xml:space="preserve">Sec. V-G and Table VIII: tracked-speed error against ground truth.</w:t>
-            </w:r>
-          </w:p>
-          <w:p>
-            <w:pPr>
-              <w:pStyle w:val="ListParagraph"/>
-              <w:numPr>
-                <w:ilvl w:val="0"/>
-                <w:numId w:val="1"/>
-              </w:numPr>
-              <w:spacing w:after="40"/>
-            </w:pPr>
-            <w:r>
-              <w:rPr>
-                <w:sz w:val="22"/>
-                <w:szCs w:val="22"/>
-                <w:rFonts w:ascii="Times New Roman" w:cs="Times New Roman" w:eastAsia="Times New Roman" w:hAnsi="Times New Roman"/>
-              </w:rPr>
-              <w:t xml:space="preserve">Sec. V-H (new), Tables IX–X: queue discharge against HCM values, calibration, repeated comparisons.</w:t>
-            </w:r>
-          </w:p>
-          <w:p>
-            <w:pPr>
-              <w:pStyle w:val="ListParagraph"/>
-              <w:numPr>
-                <w:ilvl w:val="0"/>
-                <w:numId w:val="1"/>
-              </w:numPr>
-              <w:spacing w:after="40"/>
-            </w:pPr>
-            <w:r>
-              <w:rPr>
-                <w:sz w:val="22"/>
-                <w:szCs w:val="22"/>
-                <w:rFonts w:ascii="Times New Roman" w:cs="Times New Roman" w:eastAsia="Times New Roman" w:hAnsi="Times New Roman"/>
-              </w:rPr>
-              <w:t xml:space="preserve">Sec. VI-B: kinematics limitation rewritten.</w:t>
+              <w:t xml:space="preserve"> We validated two kinds of kinematic output. (a) The tracker's speed estimates: for every confirmed track on a real vehicle, the Kalman velocity was compared with the vehicle's true speed (Table VII). The result is negative and reported as such: the mean absolute error was 0.53 m/s over 82 estimates, but the vehicles concerned moved at only 0.56 m/s on average, because tracks are confirmed almost only on queued vehicles; the pipeline therefore provides no usable kinematics for moving traffic. (b) The simulator's own kinematics against external field values: we measured queue discharge at the stop line as a traffic engineer would and compared it with the Highway Capacity Manual's base saturation flow (1900 veh/h/lane, 1.89 s headway). This revealed that the model discharged cars every 0.51 s, far too fast, because its car-following rule had no driver reaction time. We added a reaction time, calibrated it to 1.6 s (1.92 s, 1877 veh/h/lane), and repeated all main comparisons with the calibrated model: below capacity the adaptive controller reduced delay by 33.7–35.4% relative to the fixed plan. The calibration also revealed that the discharge hold's 10 m stop-line zone, chosen for the old kinematics, is too short for realistic vehicle spacing (capacity −3.7% relative to fixed timing); re-tuned on a separate seed to 20 m it reached +6.1% (Sec. IV-G). We report both.</w:t>
+            </w:r>
+          </w:p>
+          <w:p>
+            <w:pPr>
+              <w:pStyle w:val="ListParagraph"/>
+              <w:numPr>
+                <w:ilvl w:val="0"/>
+                <w:numId w:val="1"/>
+              </w:numPr>
+              <w:spacing w:after="40"/>
+            </w:pPr>
+            <w:r>
+              <w:rPr>
+                <w:sz w:val="22"/>
+                <w:szCs w:val="22"/>
+                <w:rFonts w:ascii="Times New Roman" w:cs="Times New Roman" w:eastAsia="Times New Roman" w:hAnsi="Times New Roman"/>
+              </w:rPr>
+              <w:t xml:space="preserve">Sec. III-B and IV-G: reaction time introduced as an option of rule (1).</w:t>
+            </w:r>
+          </w:p>
+          <w:p>
+            <w:pPr>
+              <w:pStyle w:val="ListParagraph"/>
+              <w:numPr>
+                <w:ilvl w:val="0"/>
+                <w:numId w:val="1"/>
+              </w:numPr>
+              <w:spacing w:after="40"/>
+            </w:pPr>
+            <w:r>
+              <w:rPr>
+                <w:sz w:val="22"/>
+                <w:szCs w:val="22"/>
+                <w:rFonts w:ascii="Times New Roman" w:cs="Times New Roman" w:eastAsia="Times New Roman" w:hAnsi="Times New Roman"/>
+              </w:rPr>
+              <w:t xml:space="preserve">Sec. IV-F and Table VII: tracked-speed error against ground truth.</w:t>
+            </w:r>
+          </w:p>
+          <w:p>
+            <w:pPr>
+              <w:pStyle w:val="ListParagraph"/>
+              <w:numPr>
+                <w:ilvl w:val="0"/>
+                <w:numId w:val="1"/>
+              </w:numPr>
+              <w:spacing w:after="40"/>
+            </w:pPr>
+            <w:r>
+              <w:rPr>
+                <w:sz w:val="22"/>
+                <w:szCs w:val="22"/>
+                <w:rFonts w:ascii="Times New Roman" w:cs="Times New Roman" w:eastAsia="Times New Roman" w:hAnsi="Times New Roman"/>
+              </w:rPr>
+              <w:t xml:space="preserve">Sec. IV-G (new), Table VIII: queue discharge against HCM values, calibration, repeated comparisons.</w:t>
+            </w:r>
+          </w:p>
+          <w:p>
+            <w:pPr>
+              <w:pStyle w:val="ListParagraph"/>
+              <w:numPr>
+                <w:ilvl w:val="0"/>
+                <w:numId w:val="1"/>
+              </w:numPr>
+              <w:spacing w:after="40"/>
+            </w:pPr>
+            <w:r>
+              <w:rPr>
+                <w:sz w:val="22"/>
+                <w:szCs w:val="22"/>
+                <w:rFonts w:ascii="Times New Roman" w:cs="Times New Roman" w:eastAsia="Times New Roman" w:hAnsi="Times New Roman"/>
+              </w:rPr>
+              <w:t xml:space="preserve">Sec. V: kinematics limitation rewritten.</w:t>
             </w:r>
           </w:p>
           <w:p>
@@ -1156,43 +1156,43 @@
                 <w:szCs w:val="22"/>
                 <w:rFonts w:ascii="Times New Roman" w:cs="Times New Roman" w:eastAsia="Times New Roman" w:hAnsi="Times New Roman"/>
               </w:rPr>
-              <w:t xml:space="preserve"> The named components do not exist in our system; we added the corresponding baselines and ablations for the components it does have. For the vision pipeline: detector variants with and without upscaling and histogram equalization (Table VII), and tracker variants without the low-confidence matching stage, without the motion model, and with immediate confirmation (Table VIII). For the controller: four re-implemented control strategies and a ten-variant ablation (Comment 1.2).</w:t>
-            </w:r>
-          </w:p>
-          <w:p>
-            <w:pPr>
-              <w:pStyle w:val="ListParagraph"/>
-              <w:numPr>
-                <w:ilvl w:val="0"/>
-                <w:numId w:val="1"/>
-              </w:numPr>
-              <w:spacing w:after="40"/>
-            </w:pPr>
-            <w:r>
-              <w:rPr>
-                <w:sz w:val="22"/>
-                <w:szCs w:val="22"/>
-                <w:rFonts w:ascii="Times New Roman" w:cs="Times New Roman" w:eastAsia="Times New Roman" w:hAnsi="Times New Roman"/>
-              </w:rPr>
-              <w:t xml:space="preserve">Sec. V-G, Tables VII–VIII (vision ablations).</w:t>
-            </w:r>
-          </w:p>
-          <w:p>
-            <w:pPr>
-              <w:pStyle w:val="ListParagraph"/>
-              <w:numPr>
-                <w:ilvl w:val="0"/>
-                <w:numId w:val="1"/>
-              </w:numPr>
-              <w:spacing w:after="40"/>
-            </w:pPr>
-            <w:r>
-              <w:rPr>
-                <w:sz w:val="22"/>
-                <w:szCs w:val="22"/>
-                <w:rFonts w:ascii="Times New Roman" w:cs="Times New Roman" w:eastAsia="Times New Roman" w:hAnsi="Times New Roman"/>
-              </w:rPr>
-              <w:t xml:space="preserve">Sec. IV-E, V-C, V-D, V-F, Tables II–IV and VI (controller baselines and ablation).</w:t>
+              <w:t xml:space="preserve"> The named components do not exist in our system; we added the corresponding baselines and ablations for the components it does have. For the vision pipeline: detector variants with and without upscaling and histogram equalization (Table VI), and tracker variants without the low-confidence matching stage, without the motion model, and with immediate confirmation (Table VII). For the controller: four re-implemented control strategies and a ten-variant ablation (Comment 1.2).</w:t>
+            </w:r>
+          </w:p>
+          <w:p>
+            <w:pPr>
+              <w:pStyle w:val="ListParagraph"/>
+              <w:numPr>
+                <w:ilvl w:val="0"/>
+                <w:numId w:val="1"/>
+              </w:numPr>
+              <w:spacing w:after="40"/>
+            </w:pPr>
+            <w:r>
+              <w:rPr>
+                <w:sz w:val="22"/>
+                <w:szCs w:val="22"/>
+                <w:rFonts w:ascii="Times New Roman" w:cs="Times New Roman" w:eastAsia="Times New Roman" w:hAnsi="Times New Roman"/>
+              </w:rPr>
+              <w:t xml:space="preserve">Sec. IV-F, Tables VI–VII (vision ablations).</w:t>
+            </w:r>
+          </w:p>
+          <w:p>
+            <w:pPr>
+              <w:pStyle w:val="ListParagraph"/>
+              <w:numPr>
+                <w:ilvl w:val="0"/>
+                <w:numId w:val="1"/>
+              </w:numPr>
+              <w:spacing w:after="40"/>
+            </w:pPr>
+            <w:r>
+              <w:rPr>
+                <w:sz w:val="22"/>
+                <w:szCs w:val="22"/>
+                <w:rFonts w:ascii="Times New Roman" w:cs="Times New Roman" w:eastAsia="Times New Roman" w:hAnsi="Times New Roman"/>
+              </w:rPr>
+              <w:t xml:space="preserve">Sec. III-E, IV-B, IV-C, IV-E, Tables II–V (controller baselines and ablation).</w:t>
             </w:r>
           </w:p>
           <w:p>
@@ -1325,61 +1325,61 @@
                 <w:szCs w:val="22"/>
                 <w:rFonts w:ascii="Times New Roman" w:cs="Times New Roman" w:eastAsia="Times New Roman" w:hAnsi="Times New Roman"/>
               </w:rPr>
-              <w:t xml:space="preserve"> Sec. IV-G now has a "Data and annotation protocol" paragraph. No real images or manual labels are used: frames are rendered from the simulator state and every ground-truth box comes from the same state, so labels are exact by construction. Nothing is trained (the cascade is pre-trained and the controller is rule-based), so there is no training split; detector and tracker parameters were fixed during development, the discharge-hold zone was chosen on a separate tuning seed (1000), capacity was measured on seeds 101–105, and all reported results use seeds 1–10 (vision: 1–4). Failure cases are quantified in Sec. V-G: 98.6% of false positives recur at fixed background locations, and recall depends strongly on vehicle class and distance (overall recall 8.2%).</w:t>
-            </w:r>
-          </w:p>
-          <w:p>
-            <w:pPr>
-              <w:pStyle w:val="ListParagraph"/>
-              <w:numPr>
-                <w:ilvl w:val="0"/>
-                <w:numId w:val="1"/>
-              </w:numPr>
-              <w:spacing w:after="40"/>
-            </w:pPr>
-            <w:r>
-              <w:rPr>
-                <w:sz w:val="22"/>
-                <w:szCs w:val="22"/>
-                <w:rFonts w:ascii="Times New Roman" w:cs="Times New Roman" w:eastAsia="Times New Roman" w:hAnsi="Times New Roman"/>
-              </w:rPr>
-              <w:t xml:space="preserve">Sec. IV-G: data and annotation protocol.</w:t>
-            </w:r>
-          </w:p>
-          <w:p>
-            <w:pPr>
-              <w:pStyle w:val="ListParagraph"/>
-              <w:numPr>
-                <w:ilvl w:val="0"/>
-                <w:numId w:val="1"/>
-              </w:numPr>
-              <w:spacing w:after="40"/>
-            </w:pPr>
-            <w:r>
-              <w:rPr>
-                <w:sz w:val="22"/>
-                <w:szCs w:val="22"/>
-                <w:rFonts w:ascii="Times New Roman" w:cs="Times New Roman" w:eastAsia="Times New Roman" w:hAnsi="Times New Roman"/>
-              </w:rPr>
-              <w:t xml:space="preserve">Sec. V-A: seed splits.</w:t>
-            </w:r>
-          </w:p>
-          <w:p>
-            <w:pPr>
-              <w:pStyle w:val="ListParagraph"/>
-              <w:numPr>
-                <w:ilvl w:val="0"/>
-                <w:numId w:val="1"/>
-              </w:numPr>
-              <w:spacing w:after="40"/>
-            </w:pPr>
-            <w:r>
-              <w:rPr>
-                <w:sz w:val="22"/>
-                <w:szCs w:val="22"/>
-                <w:rFonts w:ascii="Times New Roman" w:cs="Times New Roman" w:eastAsia="Times New Roman" w:hAnsi="Times New Roman"/>
-              </w:rPr>
-              <w:t xml:space="preserve">Sec. V-G: failure cases by type, class and distance.</w:t>
+              <w:t xml:space="preserve"> Sec. III-G now has a data and annotation protocol. No real images or manual labels are used: frames are rendered from the simulator state and every ground-truth box comes from the same state, so labels are exact by construction. Nothing is trained (the cascade is pre-trained and the controller is rule-based), so there is no training split; detector and tracker parameters were fixed during development, the discharge-hold zone was chosen on a separate tuning seed (1000), capacity was measured on seeds 101–105, and all reported results use seeds 1–10 (vision: 1–4). Failure cases are quantified in Sec. IV-F: 98.6% of false positives recur at fixed background locations, and recall depends strongly on vehicle class and distance (overall recall 8.2%).</w:t>
+            </w:r>
+          </w:p>
+          <w:p>
+            <w:pPr>
+              <w:pStyle w:val="ListParagraph"/>
+              <w:numPr>
+                <w:ilvl w:val="0"/>
+                <w:numId w:val="1"/>
+              </w:numPr>
+              <w:spacing w:after="40"/>
+            </w:pPr>
+            <w:r>
+              <w:rPr>
+                <w:sz w:val="22"/>
+                <w:szCs w:val="22"/>
+                <w:rFonts w:ascii="Times New Roman" w:cs="Times New Roman" w:eastAsia="Times New Roman" w:hAnsi="Times New Roman"/>
+              </w:rPr>
+              <w:t xml:space="preserve">Sec. III-G: data and annotation protocol.</w:t>
+            </w:r>
+          </w:p>
+          <w:p>
+            <w:pPr>
+              <w:pStyle w:val="ListParagraph"/>
+              <w:numPr>
+                <w:ilvl w:val="0"/>
+                <w:numId w:val="1"/>
+              </w:numPr>
+              <w:spacing w:after="40"/>
+            </w:pPr>
+            <w:r>
+              <w:rPr>
+                <w:sz w:val="22"/>
+                <w:szCs w:val="22"/>
+                <w:rFonts w:ascii="Times New Roman" w:cs="Times New Roman" w:eastAsia="Times New Roman" w:hAnsi="Times New Roman"/>
+              </w:rPr>
+              <w:t xml:space="preserve">Sec. IV-A: seed splits.</w:t>
+            </w:r>
+          </w:p>
+          <w:p>
+            <w:pPr>
+              <w:pStyle w:val="ListParagraph"/>
+              <w:numPr>
+                <w:ilvl w:val="0"/>
+                <w:numId w:val="1"/>
+              </w:numPr>
+              <w:spacing w:after="40"/>
+            </w:pPr>
+            <w:r>
+              <w:rPr>
+                <w:sz w:val="22"/>
+                <w:szCs w:val="22"/>
+                <w:rFonts w:ascii="Times New Roman" w:cs="Times New Roman" w:eastAsia="Times New Roman" w:hAnsi="Times New Roman"/>
+              </w:rPr>
+              <w:t xml:space="preserve">Sec. IV-F: failure cases by type, class and distance.</w:t>
             </w:r>
           </w:p>
           <w:p>
@@ -1530,7 +1530,7 @@
                 <w:szCs w:val="22"/>
                 <w:rFonts w:ascii="Times New Roman" w:cs="Times New Roman" w:eastAsia="Times New Roman" w:hAnsi="Times New Roman"/>
               </w:rPr>
-              <w:t xml:space="preserve">Abstract, Sec. IV-A, V-C, V-H, VI, VII.</w:t>
+              <w:t xml:space="preserve">Abstract, Sec. III-B, IV-B, IV-G, V, VI.</w:t>
             </w:r>
           </w:p>
           <w:p>
@@ -1711,7 +1711,7 @@
                 <w:szCs w:val="22"/>
                 <w:rFonts w:ascii="Times New Roman" w:cs="Times New Roman" w:eastAsia="Times New Roman" w:hAnsi="Times New Roman"/>
               </w:rPr>
-              <w:t xml:space="preserve">Sec. IV-E, V-C, V-D; Tables II–IV; Fig. 4.</w:t>
+              <w:t xml:space="preserve">Sec. III-E, IV-B, IV-C; Tables II–IV; Fig. 4.</w:t>
             </w:r>
           </w:p>
           <w:p>
@@ -1844,7 +1844,7 @@
                 <w:szCs w:val="22"/>
                 <w:rFonts w:ascii="Times New Roman" w:cs="Times New Roman" w:eastAsia="Times New Roman" w:hAnsi="Times New Roman"/>
               </w:rPr>
-              <w:t xml:space="preserve"> The Introduction now states the role of AI and machine learning plainly: the signal controller is a transparent rule, not a learned policy; machine learning enters through the pre-trained Haar-cascade detector, whose accuracy, failure cases and ablations are measured (Sec. V-G), and through a new data-driven calibration of the controller's parameters by search on tuning seeds with evaluation on held-out seeds (Sec. V-J). We chose to report this honestly rather than add a learned controller whose behavior could not be bounded the way rule (5) can.</w:t>
+              <w:t xml:space="preserve"> The Introduction now states the role of AI and machine learning plainly: the signal controller is a transparent rule, not a learned policy; machine learning enters through the pre-trained Haar-cascade detector, whose accuracy, failure cases and ablations are measured (Sec. IV-F), and through a new data-driven calibration of the controller's parameters by search on tuning seeds with evaluation on held-out seeds (Sec. IV-I). We chose to report this honestly rather than add a learned controller whose behavior could not be bounded the way rule (5) can.</w:t>
             </w:r>
           </w:p>
           <w:p>
@@ -1880,7 +1880,7 @@
                 <w:szCs w:val="22"/>
                 <w:rFonts w:ascii="Times New Roman" w:cs="Times New Roman" w:eastAsia="Times New Roman" w:hAnsi="Times New Roman"/>
               </w:rPr>
-              <w:t xml:space="preserve">Sec. V-G (vision evaluation), Sec. V-J (data-driven calibration).</w:t>
+              <w:t xml:space="preserve">Sec. IV-F (vision evaluation), Sec. IV-I (data-driven calibration).</w:t>
             </w:r>
           </w:p>
           <w:p>
@@ -2031,25 +2031,25 @@
                 <w:szCs w:val="22"/>
                 <w:rFonts w:ascii="Times New Roman" w:cs="Times New Roman" w:eastAsia="Times New Roman" w:hAnsi="Times New Roman"/>
               </w:rPr>
-              <w:t xml:space="preserve">Sec. V-I (new), Tables XI–XII.</w:t>
-            </w:r>
-          </w:p>
-          <w:p>
-            <w:pPr>
-              <w:pStyle w:val="ListParagraph"/>
-              <w:numPr>
-                <w:ilvl w:val="0"/>
-                <w:numId w:val="1"/>
-              </w:numPr>
-              <w:spacing w:after="40"/>
-            </w:pPr>
-            <w:r>
-              <w:rPr>
-                <w:sz w:val="22"/>
-                <w:szCs w:val="22"/>
-                <w:rFonts w:ascii="Times New Roman" w:cs="Times New Roman" w:eastAsia="Times New Roman" w:hAnsi="Times New Roman"/>
-              </w:rPr>
-              <w:t xml:space="preserve">Sec. VI-B: sensing limitation rewritten with these results.</w:t>
+              <w:t xml:space="preserve">Sec. IV-H (new), Table IX.</w:t>
+            </w:r>
+          </w:p>
+          <w:p>
+            <w:pPr>
+              <w:pStyle w:val="ListParagraph"/>
+              <w:numPr>
+                <w:ilvl w:val="0"/>
+                <w:numId w:val="1"/>
+              </w:numPr>
+              <w:spacing w:after="40"/>
+            </w:pPr>
+            <w:r>
+              <w:rPr>
+                <w:sz w:val="22"/>
+                <w:szCs w:val="22"/>
+                <w:rFonts w:ascii="Times New Roman" w:cs="Times New Roman" w:eastAsia="Times New Roman" w:hAnsi="Times New Roman"/>
+              </w:rPr>
+              <w:t xml:space="preserve">Sec. V: sensing limitation rewritten with these results.</w:t>
             </w:r>
           </w:p>
           <w:p>
@@ -2182,61 +2182,61 @@
                 <w:szCs w:val="22"/>
                 <w:rFonts w:ascii="Times New Roman" w:cs="Times New Roman" w:eastAsia="Times New Roman" w:hAnsi="Times New Roman"/>
               </w:rPr>
-              <w:t xml:space="preserve"> We agree: the original three levels were only 12–26% of capacity, which is why throughput could not differ. The revision adds three experiments. (a) Capacity: every controller's capacity was measured by flooding all approaches (Table III). (b) A steady sweep from 0.6 to 1.5 times the fixed-time capacity, ten paired seeds per level, with blocked arrivals kept in an entry queue so that unserved demand is measured; we report throughput, served share, delay including vehicles still waiting, queue growth rate, final queue and spillback (Table IV, Fig. 4). (c) A 60-minute peak period in which demand rises to 1.2 times capacity and falls back, reporting the queue over time, the peak queue, the time to clear the queue after the peak, spillback duration, peak throughput and total delay (Fig. 5). In the peak period the queue reached 495 vehicles under fixed timing and 255 with the discharge hold; fixed timing cleared it 13.9 min after the peak, the hold cleared it 7.3 min after the peak, and the original density rule did not clear it within the hour. These experiments exposed a failure of the original density rule near capacity, which the new discharge-hold rule (Sec. IV-D) corrects.</w:t>
-            </w:r>
-          </w:p>
-          <w:p>
-            <w:pPr>
-              <w:pStyle w:val="ListParagraph"/>
-              <w:numPr>
-                <w:ilvl w:val="0"/>
-                <w:numId w:val="1"/>
-              </w:numPr>
-              <w:spacing w:after="40"/>
-            </w:pPr>
-            <w:r>
-              <w:rPr>
-                <w:sz w:val="22"/>
-                <w:szCs w:val="22"/>
-                <w:rFonts w:ascii="Times New Roman" w:cs="Times New Roman" w:eastAsia="Times New Roman" w:hAnsi="Times New Roman"/>
-              </w:rPr>
-              <w:t xml:space="preserve">Sec. IV-A (entry queue and entry speed for these runs), IV-D (discharge hold).</w:t>
-            </w:r>
-          </w:p>
-          <w:p>
-            <w:pPr>
-              <w:pStyle w:val="ListParagraph"/>
-              <w:numPr>
-                <w:ilvl w:val="0"/>
-                <w:numId w:val="1"/>
-              </w:numPr>
-              <w:spacing w:after="40"/>
-            </w:pPr>
-            <w:r>
-              <w:rPr>
-                <w:sz w:val="22"/>
-                <w:szCs w:val="22"/>
-                <w:rFonts w:ascii="Times New Roman" w:cs="Times New Roman" w:eastAsia="Times New Roman" w:hAnsi="Times New Roman"/>
-              </w:rPr>
-              <w:t xml:space="preserve">Sec. V-D: capacity (Table III), steady sweep (Table IV, Fig. 4) and peak period (Fig. 5).</w:t>
-            </w:r>
-          </w:p>
-          <w:p>
-            <w:pPr>
-              <w:pStyle w:val="ListParagraph"/>
-              <w:numPr>
-                <w:ilvl w:val="0"/>
-                <w:numId w:val="1"/>
-              </w:numPr>
-              <w:spacing w:after="40"/>
-            </w:pPr>
-            <w:r>
-              <w:rPr>
-                <w:sz w:val="22"/>
-                <w:szCs w:val="22"/>
-                <w:rFonts w:ascii="Times New Roman" w:cs="Times New Roman" w:eastAsia="Times New Roman" w:hAnsi="Times New Roman"/>
-              </w:rPr>
-              <w:t xml:space="preserve">Abstract, Sec. VI-A and VII: conclusions about congestion management rewritten.</w:t>
+              <w:t xml:space="preserve"> We agree: the original three levels were only 12–26% of capacity, which is why throughput could not differ. The revision adds three experiments. (a) Capacity: every controller's capacity was measured by flooding all approaches (Table III). (b) A steady sweep from 0.6 to 1.5 times the fixed-time capacity, ten paired seeds per level, with blocked arrivals kept in an entry queue so that unserved demand is measured; we report throughput, served share, delay including vehicles still waiting, queue growth rate, final queue and spillback (Table IV, Fig. 4). (c) A 60-minute peak period in which demand rises to 1.2 times capacity and falls back, reporting the queue over time, the peak queue, the time to clear the queue after the peak, spillback duration, peak throughput and total delay (Fig. 5). In the peak period the queue reached 495 vehicles under fixed timing and 255 with the discharge hold; fixed timing cleared it 13.9 min after the peak, the hold cleared it 7.3 min after the peak, and the original density rule did not clear it within the hour. These experiments exposed a failure of the original density rule near capacity, which the new discharge-hold rule (Sec. III-D) corrects.</w:t>
+            </w:r>
+          </w:p>
+          <w:p>
+            <w:pPr>
+              <w:pStyle w:val="ListParagraph"/>
+              <w:numPr>
+                <w:ilvl w:val="0"/>
+                <w:numId w:val="1"/>
+              </w:numPr>
+              <w:spacing w:after="40"/>
+            </w:pPr>
+            <w:r>
+              <w:rPr>
+                <w:sz w:val="22"/>
+                <w:szCs w:val="22"/>
+                <w:rFonts w:ascii="Times New Roman" w:cs="Times New Roman" w:eastAsia="Times New Roman" w:hAnsi="Times New Roman"/>
+              </w:rPr>
+              <w:t xml:space="preserve">Sec. III-B (entry queue and entry speed for these runs), III-D (discharge hold).</w:t>
+            </w:r>
+          </w:p>
+          <w:p>
+            <w:pPr>
+              <w:pStyle w:val="ListParagraph"/>
+              <w:numPr>
+                <w:ilvl w:val="0"/>
+                <w:numId w:val="1"/>
+              </w:numPr>
+              <w:spacing w:after="40"/>
+            </w:pPr>
+            <w:r>
+              <w:rPr>
+                <w:sz w:val="22"/>
+                <w:szCs w:val="22"/>
+                <w:rFonts w:ascii="Times New Roman" w:cs="Times New Roman" w:eastAsia="Times New Roman" w:hAnsi="Times New Roman"/>
+              </w:rPr>
+              <w:t xml:space="preserve">Sec. IV-C: capacity (Table III), steady sweep (Table IV, Fig. 4) and peak period (Fig. 5).</w:t>
+            </w:r>
+          </w:p>
+          <w:p>
+            <w:pPr>
+              <w:pStyle w:val="ListParagraph"/>
+              <w:numPr>
+                <w:ilvl w:val="0"/>
+                <w:numId w:val="1"/>
+              </w:numPr>
+              <w:spacing w:after="40"/>
+            </w:pPr>
+            <w:r>
+              <w:rPr>
+                <w:sz w:val="22"/>
+                <w:szCs w:val="22"/>
+                <w:rFonts w:ascii="Times New Roman" w:cs="Times New Roman" w:eastAsia="Times New Roman" w:hAnsi="Times New Roman"/>
+              </w:rPr>
+              <w:t xml:space="preserve">Abstract, Sec. V and VI: conclusions about congestion management rewritten.</w:t>
             </w:r>
           </w:p>
           <w:p>
@@ -2260,7 +2260,7 @@
                 <w:szCs w:val="22"/>
                 <w:rFonts w:ascii="Times New Roman" w:cs="Times New Roman" w:eastAsia="Times New Roman" w:hAnsi="Times New Roman"/>
               </w:rPr>
-              <w:t xml:space="preserve"> Addressed. Turning traffic and stochastic arrivals remain future work (Sec. VI-B).</w:t>
+              <w:t xml:space="preserve"> Addressed. Turning traffic and stochastic arrivals remain future work (Sec. V).</w:t>
             </w:r>
           </w:p>
         </w:tc>
@@ -2369,61 +2369,61 @@
                 <w:szCs w:val="22"/>
                 <w:rFonts w:ascii="Times New Roman" w:cs="Times New Roman" w:eastAsia="Times New Roman" w:hAnsi="Times New Roman"/>
               </w:rPr>
-              <w:t xml:space="preserve"> Two analyses were added. The extended ablation (Table VI) measures each part of the score separately: the queued/moving distinction carries the benefit, while the hand-set class weights do not help. The weights were then calibrated from data: a random search over the class weights, the queued/moving ratio and θ on tuning seeds 1001–1002, with the best setting compared against the hand-set weights on held-out seeds 1–10. On the held-out seeds the calibrated score changed delay by −2.0% (medium, p 0.374), −4.9% (high, p 0.036), +2.2% (0.9x capacity, p 0.014) relative to the hand-set weights.</w:t>
-            </w:r>
-          </w:p>
-          <w:p>
-            <w:pPr>
-              <w:pStyle w:val="ListParagraph"/>
-              <w:numPr>
-                <w:ilvl w:val="0"/>
-                <w:numId w:val="1"/>
-              </w:numPr>
-              <w:spacing w:after="40"/>
-            </w:pPr>
-            <w:r>
-              <w:rPr>
-                <w:sz w:val="22"/>
-                <w:szCs w:val="22"/>
-                <w:rFonts w:ascii="Times New Roman" w:cs="Times New Roman" w:eastAsia="Times New Roman" w:hAnsi="Times New Roman"/>
-              </w:rPr>
-              <w:t xml:space="preserve">Sec. V-F, Table VI (ablation).</w:t>
-            </w:r>
-          </w:p>
-          <w:p>
-            <w:pPr>
-              <w:pStyle w:val="ListParagraph"/>
-              <w:numPr>
-                <w:ilvl w:val="0"/>
-                <w:numId w:val="1"/>
-              </w:numPr>
-              <w:spacing w:after="40"/>
-            </w:pPr>
-            <w:r>
-              <w:rPr>
-                <w:sz w:val="22"/>
-                <w:szCs w:val="22"/>
-                <w:rFonts w:ascii="Times New Roman" w:cs="Times New Roman" w:eastAsia="Times New Roman" w:hAnsi="Times New Roman"/>
-              </w:rPr>
-              <w:t xml:space="preserve">Sec. V-J (new), Table XIII (calibration and held-out test).</w:t>
-            </w:r>
-          </w:p>
-          <w:p>
-            <w:pPr>
-              <w:pStyle w:val="ListParagraph"/>
-              <w:numPr>
-                <w:ilvl w:val="0"/>
-                <w:numId w:val="1"/>
-              </w:numPr>
-              <w:spacing w:after="40"/>
-            </w:pPr>
-            <w:r>
-              <w:rPr>
-                <w:sz w:val="22"/>
-                <w:szCs w:val="22"/>
-                <w:rFonts w:ascii="Times New Roman" w:cs="Times New Roman" w:eastAsia="Times New Roman" w:hAnsi="Times New Roman"/>
-              </w:rPr>
-              <w:t xml:space="preserve">Sec. VI-B.</w:t>
+              <w:t xml:space="preserve"> Two analyses were added. The extended ablation (Table V) measures each part of the score separately: the queued/moving distinction carries the benefit, while the hand-set class weights do not help. The weights were then calibrated from data: a random search over the class weights, the queued/moving ratio and θ on tuning seeds 1001–1002, with the best setting compared against the hand-set weights on held-out seeds 1–10. On the held-out seeds the calibrated score changed delay by −2.0% (medium, p 0.374), −4.9% (high, p 0.036), +2.2% (0.9x capacity, p 0.014) relative to the hand-set weights.</w:t>
+            </w:r>
+          </w:p>
+          <w:p>
+            <w:pPr>
+              <w:pStyle w:val="ListParagraph"/>
+              <w:numPr>
+                <w:ilvl w:val="0"/>
+                <w:numId w:val="1"/>
+              </w:numPr>
+              <w:spacing w:after="40"/>
+            </w:pPr>
+            <w:r>
+              <w:rPr>
+                <w:sz w:val="22"/>
+                <w:szCs w:val="22"/>
+                <w:rFonts w:ascii="Times New Roman" w:cs="Times New Roman" w:eastAsia="Times New Roman" w:hAnsi="Times New Roman"/>
+              </w:rPr>
+              <w:t xml:space="preserve">Sec. IV-E, Table V (ablation).</w:t>
+            </w:r>
+          </w:p>
+          <w:p>
+            <w:pPr>
+              <w:pStyle w:val="ListParagraph"/>
+              <w:numPr>
+                <w:ilvl w:val="0"/>
+                <w:numId w:val="1"/>
+              </w:numPr>
+              <w:spacing w:after="40"/>
+            </w:pPr>
+            <w:r>
+              <w:rPr>
+                <w:sz w:val="22"/>
+                <w:szCs w:val="22"/>
+                <w:rFonts w:ascii="Times New Roman" w:cs="Times New Roman" w:eastAsia="Times New Roman" w:hAnsi="Times New Roman"/>
+              </w:rPr>
+              <w:t xml:space="preserve">Sec. IV-I (new), Table X (calibration and held-out test).</w:t>
+            </w:r>
+          </w:p>
+          <w:p>
+            <w:pPr>
+              <w:pStyle w:val="ListParagraph"/>
+              <w:numPr>
+                <w:ilvl w:val="0"/>
+                <w:numId w:val="1"/>
+              </w:numPr>
+              <w:spacing w:after="40"/>
+            </w:pPr>
+            <w:r>
+              <w:rPr>
+                <w:sz w:val="22"/>
+                <w:szCs w:val="22"/>
+                <w:rFonts w:ascii="Times New Roman" w:cs="Times New Roman" w:eastAsia="Times New Roman" w:hAnsi="Times New Roman"/>
+              </w:rPr>
+              <w:t xml:space="preserve">Sec. V.</w:t>
             </w:r>
           </w:p>
           <w:p>

</xml_diff>